<commit_message>
Update kids quote photos and add new ones
</commit_message>
<xml_diff>
--- a/assets/quotes/Kids Quotes Images Procedure.docx
+++ b/assets/quotes/Kids Quotes Images Procedure.docx
@@ -68,10 +68,7 @@
       </w:r>
       <w:proofErr w:type="spellStart"/>
       <w:r>
-        <w:t>STARTING_DATE</w:t>
-      </w:r>
-      <w:r>
-        <w:t>&amp;</w:t>
+        <w:t>STARTING_DATE&amp;</w:t>
       </w:r>
       <w:r>
         <w:t>num</w:t>
@@ -152,6 +149,74 @@
       <w:proofErr w:type="spellEnd"/>
       <w:r>
         <w:t>=999</w:t>
+      </w:r>
+    </w:p>
+    <w:p>
+      <w:pPr>
+        <w:pStyle w:val="ListParagraph"/>
+        <w:numPr>
+          <w:ilvl w:val="0"/>
+          <w:numId w:val="2"/>
+        </w:numPr>
+      </w:pPr>
+      <w:r>
+        <w:t>S</w:t>
+      </w:r>
+      <w:r>
+        <w:t>creenshot each image and save them to a folder</w:t>
+      </w:r>
+    </w:p>
+    <w:p>
+      <w:pPr>
+        <w:pStyle w:val="ListParagraph"/>
+        <w:numPr>
+          <w:ilvl w:val="0"/>
+          <w:numId w:val="2"/>
+        </w:numPr>
+      </w:pPr>
+      <w:r>
+        <w:t xml:space="preserve">Open the folder and use </w:t>
+      </w:r>
+      <w:proofErr w:type="spellStart"/>
+      <w:r>
+        <w:t>gemini</w:t>
+      </w:r>
+      <w:proofErr w:type="spellEnd"/>
+      <w:r>
+        <w:t xml:space="preserve"> to </w:t>
+      </w:r>
+      <w:r>
+        <w:t>rename each image to be like kids-quotes-598.jpg and resize each image to be 867x501 pixels</w:t>
+      </w:r>
+    </w:p>
+    <w:p>
+      <w:pPr>
+        <w:pStyle w:val="ListParagraph"/>
+        <w:numPr>
+          <w:ilvl w:val="0"/>
+          <w:numId w:val="2"/>
+        </w:numPr>
+      </w:pPr>
+      <w:r>
+        <w:t>Move the images into the ~/Dropbox/HTML/MoritzFamily.com/assets/quotes/20__ folder</w:t>
+      </w:r>
+    </w:p>
+    <w:p>
+      <w:pPr>
+        <w:pStyle w:val="ListParagraph"/>
+        <w:numPr>
+          <w:ilvl w:val="0"/>
+          <w:numId w:val="2"/>
+        </w:numPr>
+      </w:pPr>
+      <w:r>
+        <w:t>Save the whole folder of images to the TINY_BLUE flash drive that plugs into the kitchen digital picture frame</w:t>
+      </w:r>
+    </w:p>
+    <w:p/>
+    <w:p>
+      <w:r>
+        <w:t>Old approach using Photoshop:</w:t>
       </w:r>
     </w:p>
     <w:p>

</xml_diff>